<commit_message>
Deployed 9c9e531a with MkDocs version: 1.6.1
</commit_message>
<xml_diff>
--- a/download/entity.docx
+++ b/download/entity.docx
@@ -1413,53 +1413,6 @@
             </w:pPr>
             <w:r>
               <w:t xml:space="preserve">Read all entities belonging to parties owned by the organisation.</w:t>
-            </w:r>
-          </w:p>
-        </w:tc>
-        <w:tc>
-          <w:tcPr/>
-          <w:p>
-            <w:pPr>
-              <w:pStyle w:val="Compact"/>
-            </w:pPr>
-            <w:r>
-              <w:t xml:space="preserve">DONE</w:t>
-            </w:r>
-          </w:p>
-        </w:tc>
-      </w:tr>
-      <w:tr>
-        <w:tc>
-          <w:tcPr/>
-          <w:p>
-            <w:pPr>
-              <w:pStyle w:val="Compact"/>
-            </w:pPr>
-            <w:r>
-              <w:t xml:space="preserve">ENT-ORG002</w:t>
-            </w:r>
-          </w:p>
-        </w:tc>
-        <w:tc>
-          <w:tcPr/>
-          <w:p>
-            <w:pPr>
-              <w:pStyle w:val="Compact"/>
-            </w:pPr>
-            <w:r>
-              <w:t xml:space="preserve">Read all entities with business id type</w:t>
-            </w:r>
-            <w:r>
-              <w:t xml:space="preserve"> </w:t>
-            </w:r>
-            <w:r>
-              <w:rPr>
-                <w:rStyle w:val="VerbatimChar"/>
-              </w:rPr>
-              <w:t xml:space="preserve">email</w:t>
-            </w:r>
-            <w:r>
-              <w:t xml:space="preserve">. Temporary policy for test environments with email based entities for professional users.</w:t>
             </w:r>
           </w:p>
         </w:tc>

</xml_diff>